<commit_message>
Add all twelve journal release and due dates to the course calendar
</commit_message>
<xml_diff>
--- a/guide/PSY355-Course-Website-Guide.docx
+++ b/guide/PSY355-Course-Website-Guide.docx
@@ -145,20 +145,7 @@
         <w:spacing w:after="120"/>
       </w:pPr>
       <w:r>
-        <w:rPr>
-          <w:rFonts w:ascii="IBM Plex Sans" w:hAnsi="IBM Plex Sans" w:cs="IBM Plex Sans"/>
-          <w:b w:val="0"/>
-          <w:sz w:val="22"/>
-        </w:rPr>
-      </w:r>
-      <w:r>
-        <w:rPr>
-          <w:b/>
-        </w:rPr>
-        <w:t xml:space="preserve">Course Calendar: </w:t>
-      </w:r>
-      <w:r>
-        <w:t>Check the class schedule and delivery mode. Assignment instructions and deadlines are provided in Blackboard.</w:t>
+        <w:t>Course Calendar: Check class dates, journal release dates and due dates. All times are Eastern. Open Blackboard for journal instructions, submission details and approved changes.</w:t>
       </w:r>
     </w:p>
     <w:p>

</xml_diff>